<commit_message>
chore: remove obsolete and unused files
</commit_message>
<xml_diff>
--- a/fasl_4/الفصل_الرابع_النهائي.docx
+++ b/fasl_4/الفصل_الرابع_النهائي.docx
@@ -424,7 +424,7 @@
                 <w:rFonts w:ascii="Arial" w:hAnsi="Arial"/>
                 <w:sz w:val="24"/>
               </w:rPr>
-              <w:t>المجموعة التجريبية الأولى (تنافسي × محدد)</w:t>
+              <w:t>المجموعة التجريبية الأولى (تنافسي × مفتوح)</w:t>
             </w:r>
           </w:p>
         </w:tc>
@@ -460,7 +460,7 @@
                 <w:rFonts w:ascii="Arial" w:hAnsi="Arial"/>
                 <w:sz w:val="24"/>
               </w:rPr>
-              <w:t>18.40</w:t>
+              <w:t>18.30</w:t>
             </w:r>
           </w:p>
         </w:tc>
@@ -478,7 +478,7 @@
                 <w:rFonts w:ascii="Arial" w:hAnsi="Arial"/>
                 <w:sz w:val="24"/>
               </w:rPr>
-              <w:t>2.93</w:t>
+              <w:t>4.45</w:t>
             </w:r>
           </w:p>
         </w:tc>
@@ -498,7 +498,7 @@
                 <w:rFonts w:ascii="Arial" w:hAnsi="Arial"/>
                 <w:sz w:val="24"/>
               </w:rPr>
-              <w:t>المجموعة التجريبية الثانية (تنافسي × مفتوح)</w:t>
+              <w:t>المجموعة التجريبية الثانية (تنافسي × محدد)</w:t>
             </w:r>
           </w:p>
         </w:tc>
@@ -534,7 +534,7 @@
                 <w:rFonts w:ascii="Arial" w:hAnsi="Arial"/>
                 <w:sz w:val="24"/>
               </w:rPr>
-              <w:t>18.30</w:t>
+              <w:t>18.40</w:t>
             </w:r>
           </w:p>
         </w:tc>
@@ -552,7 +552,7 @@
                 <w:rFonts w:ascii="Arial" w:hAnsi="Arial"/>
                 <w:sz w:val="24"/>
               </w:rPr>
-              <w:t>4.45</w:t>
+              <w:t>2.93</w:t>
             </w:r>
           </w:p>
         </w:tc>
@@ -572,7 +572,7 @@
                 <w:rFonts w:ascii="Arial" w:hAnsi="Arial"/>
                 <w:sz w:val="24"/>
               </w:rPr>
-              <w:t>المجموعة التجريبية الثالثة (تشاركي × محدد)</w:t>
+              <w:t>المجموعة التجريبية الثالثة (تشاركي × مفتوح)</w:t>
             </w:r>
           </w:p>
         </w:tc>
@@ -608,7 +608,7 @@
                 <w:rFonts w:ascii="Arial" w:hAnsi="Arial"/>
                 <w:sz w:val="24"/>
               </w:rPr>
-              <w:t>22.20</w:t>
+              <w:t>21.90</w:t>
             </w:r>
           </w:p>
         </w:tc>
@@ -626,7 +626,7 @@
                 <w:rFonts w:ascii="Arial" w:hAnsi="Arial"/>
                 <w:sz w:val="24"/>
               </w:rPr>
-              <w:t>2.12</w:t>
+              <w:t>3.49</w:t>
             </w:r>
           </w:p>
         </w:tc>
@@ -646,7 +646,7 @@
                 <w:rFonts w:ascii="Arial" w:hAnsi="Arial"/>
                 <w:sz w:val="24"/>
               </w:rPr>
-              <w:t>المجموعة التجريبية الرابعة (تشاركي × مفتوح)</w:t>
+              <w:t>المجموعة التجريبية الرابعة (تشاركي × محدد)</w:t>
             </w:r>
           </w:p>
         </w:tc>
@@ -682,7 +682,7 @@
                 <w:rFonts w:ascii="Arial" w:hAnsi="Arial"/>
                 <w:sz w:val="24"/>
               </w:rPr>
-              <w:t>21.90</w:t>
+              <w:t>22.20</w:t>
             </w:r>
           </w:p>
         </w:tc>
@@ -700,7 +700,7 @@
                 <w:rFonts w:ascii="Arial" w:hAnsi="Arial"/>
                 <w:sz w:val="24"/>
               </w:rPr>
-              <w:t>3.49</w:t>
+              <w:t>2.12</w:t>
             </w:r>
           </w:p>
         </w:tc>
@@ -841,7 +841,7 @@
                 <w:rFonts w:ascii="Arial" w:hAnsi="Arial"/>
                 <w:sz w:val="24"/>
               </w:rPr>
-              <w:t>المجموعة التجريبية الأولى (تنافسي × محدد)</w:t>
+              <w:t>المجموعة التجريبية الأولى (تنافسي × مفتوح)</w:t>
             </w:r>
           </w:p>
         </w:tc>
@@ -877,7 +877,7 @@
                 <w:rFonts w:ascii="Arial" w:hAnsi="Arial"/>
                 <w:sz w:val="24"/>
               </w:rPr>
-              <w:t>196.75</w:t>
+              <w:t>220.25</w:t>
             </w:r>
           </w:p>
         </w:tc>
@@ -895,7 +895,7 @@
                 <w:rFonts w:ascii="Arial" w:hAnsi="Arial"/>
                 <w:sz w:val="24"/>
               </w:rPr>
-              <w:t>28.19</w:t>
+              <w:t>19.70</w:t>
             </w:r>
           </w:p>
         </w:tc>
@@ -915,7 +915,7 @@
                 <w:rFonts w:ascii="Arial" w:hAnsi="Arial"/>
                 <w:sz w:val="24"/>
               </w:rPr>
-              <w:t>المجموعة التجريبية الثانية (تنافسي × مفتوح)</w:t>
+              <w:t>المجموعة التجريبية الثانية (تنافسي × محدد)</w:t>
             </w:r>
           </w:p>
         </w:tc>
@@ -951,7 +951,7 @@
                 <w:rFonts w:ascii="Arial" w:hAnsi="Arial"/>
                 <w:sz w:val="24"/>
               </w:rPr>
-              <w:t>220.25</w:t>
+              <w:t>196.75</w:t>
             </w:r>
           </w:p>
         </w:tc>
@@ -969,7 +969,7 @@
                 <w:rFonts w:ascii="Arial" w:hAnsi="Arial"/>
                 <w:sz w:val="24"/>
               </w:rPr>
-              <w:t>19.70</w:t>
+              <w:t>28.19</w:t>
             </w:r>
           </w:p>
         </w:tc>
@@ -989,7 +989,7 @@
                 <w:rFonts w:ascii="Arial" w:hAnsi="Arial"/>
                 <w:sz w:val="24"/>
               </w:rPr>
-              <w:t>المجموعة التجريبية الثالثة (تشاركي × محدد)</w:t>
+              <w:t>المجموعة التجريبية الثالثة (تشاركي × مفتوح)</w:t>
             </w:r>
           </w:p>
         </w:tc>
@@ -1025,7 +1025,7 @@
                 <w:rFonts w:ascii="Arial" w:hAnsi="Arial"/>
                 <w:sz w:val="24"/>
               </w:rPr>
-              <w:t>210.65</w:t>
+              <w:t>231.25</w:t>
             </w:r>
           </w:p>
         </w:tc>
@@ -1043,7 +1043,7 @@
                 <w:rFonts w:ascii="Arial" w:hAnsi="Arial"/>
                 <w:sz w:val="24"/>
               </w:rPr>
-              <w:t>28.42</w:t>
+              <w:t>18.73</w:t>
             </w:r>
           </w:p>
         </w:tc>
@@ -1063,7 +1063,7 @@
                 <w:rFonts w:ascii="Arial" w:hAnsi="Arial"/>
                 <w:sz w:val="24"/>
               </w:rPr>
-              <w:t>المجموعة التجريبية الرابعة (تشاركي × مفتوح)</w:t>
+              <w:t>المجموعة التجريبية الرابعة (تشاركي × محدد)</w:t>
             </w:r>
           </w:p>
         </w:tc>
@@ -1099,7 +1099,7 @@
                 <w:rFonts w:ascii="Arial" w:hAnsi="Arial"/>
                 <w:sz w:val="24"/>
               </w:rPr>
-              <w:t>231.25</w:t>
+              <w:t>210.65</w:t>
             </w:r>
           </w:p>
         </w:tc>
@@ -1117,7 +1117,7 @@
                 <w:rFonts w:ascii="Arial" w:hAnsi="Arial"/>
                 <w:sz w:val="24"/>
               </w:rPr>
-              <w:t>18.73</w:t>
+              <w:t>28.42</w:t>
             </w:r>
           </w:p>
         </w:tc>
@@ -1215,7 +1215,7 @@
                 <w:b/>
                 <w:sz w:val="24"/>
               </w:rPr>
-              <w:t>م1 (تنافسي×محدد)</w:t>
+              <w:t>م1 (تنافسي×مفتوح)</w:t>
             </w:r>
           </w:p>
         </w:tc>
@@ -1234,7 +1234,7 @@
                 <w:b/>
                 <w:sz w:val="24"/>
               </w:rPr>
-              <w:t>م2 (تنافسي×مفتوح)</w:t>
+              <w:t>م2 (تنافسي×محدد)</w:t>
             </w:r>
           </w:p>
         </w:tc>
@@ -1253,7 +1253,7 @@
                 <w:b/>
                 <w:sz w:val="24"/>
               </w:rPr>
-              <w:t>م3 (تشاركي×محدد)</w:t>
+              <w:t>م3 (تشاركي×مفتوح)</w:t>
             </w:r>
           </w:p>
         </w:tc>
@@ -1272,7 +1272,7 @@
                 <w:b/>
                 <w:sz w:val="24"/>
               </w:rPr>
-              <w:t>م4 (تشاركي×مفتوح)</w:t>
+              <w:t>م4 (تشاركي×محدد)</w:t>
             </w:r>
           </w:p>
         </w:tc>
@@ -1310,6 +1310,24 @@
                 <w:rFonts w:ascii="Arial" w:hAnsi="Arial"/>
                 <w:sz w:val="24"/>
               </w:rPr>
+              <w:t>28.05</w:t>
+            </w:r>
+          </w:p>
+        </w:tc>
+        <w:tc>
+          <w:tcPr>
+            <w:tcW w:type="dxa" w:w="1728"/>
+          </w:tcPr>
+          <w:p>
+            <w:pPr>
+              <w:jc w:val="center"/>
+              <w:bidi w:val="1"/>
+            </w:pPr>
+            <w:r>
+              <w:rPr>
+                <w:rFonts w:ascii="Arial" w:hAnsi="Arial"/>
+                <w:sz w:val="24"/>
+              </w:rPr>
               <w:t>24.55</w:t>
             </w:r>
           </w:p>
@@ -1328,7 +1346,7 @@
                 <w:rFonts w:ascii="Arial" w:hAnsi="Arial"/>
                 <w:sz w:val="24"/>
               </w:rPr>
-              <w:t>28.05</w:t>
+              <w:t>28.65</w:t>
             </w:r>
           </w:p>
         </w:tc>
@@ -1347,24 +1365,6 @@
                 <w:sz w:val="24"/>
               </w:rPr>
               <w:t>25.75</w:t>
-            </w:r>
-          </w:p>
-        </w:tc>
-        <w:tc>
-          <w:tcPr>
-            <w:tcW w:type="dxa" w:w="1728"/>
-          </w:tcPr>
-          <w:p>
-            <w:pPr>
-              <w:jc w:val="center"/>
-              <w:bidi w:val="1"/>
-            </w:pPr>
-            <w:r>
-              <w:rPr>
-                <w:rFonts w:ascii="Arial" w:hAnsi="Arial"/>
-                <w:sz w:val="24"/>
-              </w:rPr>
-              <w:t>28.65</w:t>
             </w:r>
           </w:p>
         </w:tc>
@@ -1402,6 +1402,24 @@
                 <w:rFonts w:ascii="Arial" w:hAnsi="Arial"/>
                 <w:sz w:val="24"/>
               </w:rPr>
+              <w:t>26.90</w:t>
+            </w:r>
+          </w:p>
+        </w:tc>
+        <w:tc>
+          <w:tcPr>
+            <w:tcW w:type="dxa" w:w="1728"/>
+          </w:tcPr>
+          <w:p>
+            <w:pPr>
+              <w:jc w:val="center"/>
+              <w:bidi w:val="1"/>
+            </w:pPr>
+            <w:r>
+              <w:rPr>
+                <w:rFonts w:ascii="Arial" w:hAnsi="Arial"/>
+                <w:sz w:val="24"/>
+              </w:rPr>
               <w:t>25.05</w:t>
             </w:r>
           </w:p>
@@ -1420,7 +1438,7 @@
                 <w:rFonts w:ascii="Arial" w:hAnsi="Arial"/>
                 <w:sz w:val="24"/>
               </w:rPr>
-              <w:t>26.90</w:t>
+              <w:t>28.45</w:t>
             </w:r>
           </w:p>
         </w:tc>
@@ -1439,24 +1457,6 @@
                 <w:sz w:val="24"/>
               </w:rPr>
               <w:t>24.85</w:t>
-            </w:r>
-          </w:p>
-        </w:tc>
-        <w:tc>
-          <w:tcPr>
-            <w:tcW w:type="dxa" w:w="1728"/>
-          </w:tcPr>
-          <w:p>
-            <w:pPr>
-              <w:jc w:val="center"/>
-              <w:bidi w:val="1"/>
-            </w:pPr>
-            <w:r>
-              <w:rPr>
-                <w:rFonts w:ascii="Arial" w:hAnsi="Arial"/>
-                <w:sz w:val="24"/>
-              </w:rPr>
-              <w:t>28.45</w:t>
             </w:r>
           </w:p>
         </w:tc>
@@ -1494,6 +1494,24 @@
                 <w:rFonts w:ascii="Arial" w:hAnsi="Arial"/>
                 <w:sz w:val="24"/>
               </w:rPr>
+              <w:t>26.50</w:t>
+            </w:r>
+          </w:p>
+        </w:tc>
+        <w:tc>
+          <w:tcPr>
+            <w:tcW w:type="dxa" w:w="1728"/>
+          </w:tcPr>
+          <w:p>
+            <w:pPr>
+              <w:jc w:val="center"/>
+              <w:bidi w:val="1"/>
+            </w:pPr>
+            <w:r>
+              <w:rPr>
+                <w:rFonts w:ascii="Arial" w:hAnsi="Arial"/>
+                <w:sz w:val="24"/>
+              </w:rPr>
               <w:t>24.30</w:t>
             </w:r>
           </w:p>
@@ -1512,7 +1530,7 @@
                 <w:rFonts w:ascii="Arial" w:hAnsi="Arial"/>
                 <w:sz w:val="24"/>
               </w:rPr>
-              <w:t>26.50</w:t>
+              <w:t>29.25</w:t>
             </w:r>
           </w:p>
         </w:tc>
@@ -1531,24 +1549,6 @@
                 <w:sz w:val="24"/>
               </w:rPr>
               <w:t>26.30</w:t>
-            </w:r>
-          </w:p>
-        </w:tc>
-        <w:tc>
-          <w:tcPr>
-            <w:tcW w:type="dxa" w:w="1728"/>
-          </w:tcPr>
-          <w:p>
-            <w:pPr>
-              <w:jc w:val="center"/>
-              <w:bidi w:val="1"/>
-            </w:pPr>
-            <w:r>
-              <w:rPr>
-                <w:rFonts w:ascii="Arial" w:hAnsi="Arial"/>
-                <w:sz w:val="24"/>
-              </w:rPr>
-              <w:t>29.25</w:t>
             </w:r>
           </w:p>
         </w:tc>
@@ -1586,6 +1586,24 @@
                 <w:rFonts w:ascii="Arial" w:hAnsi="Arial"/>
                 <w:sz w:val="24"/>
               </w:rPr>
+              <w:t>28.20</w:t>
+            </w:r>
+          </w:p>
+        </w:tc>
+        <w:tc>
+          <w:tcPr>
+            <w:tcW w:type="dxa" w:w="1728"/>
+          </w:tcPr>
+          <w:p>
+            <w:pPr>
+              <w:jc w:val="center"/>
+              <w:bidi w:val="1"/>
+            </w:pPr>
+            <w:r>
+              <w:rPr>
+                <w:rFonts w:ascii="Arial" w:hAnsi="Arial"/>
+                <w:sz w:val="24"/>
+              </w:rPr>
               <w:t>23.90</w:t>
             </w:r>
           </w:p>
@@ -1604,7 +1622,7 @@
                 <w:rFonts w:ascii="Arial" w:hAnsi="Arial"/>
                 <w:sz w:val="24"/>
               </w:rPr>
-              <w:t>28.20</w:t>
+              <w:t>29.15</w:t>
             </w:r>
           </w:p>
         </w:tc>
@@ -1623,24 +1641,6 @@
                 <w:sz w:val="24"/>
               </w:rPr>
               <w:t>26.40</w:t>
-            </w:r>
-          </w:p>
-        </w:tc>
-        <w:tc>
-          <w:tcPr>
-            <w:tcW w:type="dxa" w:w="1728"/>
-          </w:tcPr>
-          <w:p>
-            <w:pPr>
-              <w:jc w:val="center"/>
-              <w:bidi w:val="1"/>
-            </w:pPr>
-            <w:r>
-              <w:rPr>
-                <w:rFonts w:ascii="Arial" w:hAnsi="Arial"/>
-                <w:sz w:val="24"/>
-              </w:rPr>
-              <w:t>29.15</w:t>
             </w:r>
           </w:p>
         </w:tc>
@@ -1678,6 +1678,24 @@
                 <w:rFonts w:ascii="Arial" w:hAnsi="Arial"/>
                 <w:sz w:val="24"/>
               </w:rPr>
+              <w:t>26.80</w:t>
+            </w:r>
+          </w:p>
+        </w:tc>
+        <w:tc>
+          <w:tcPr>
+            <w:tcW w:type="dxa" w:w="1728"/>
+          </w:tcPr>
+          <w:p>
+            <w:pPr>
+              <w:jc w:val="center"/>
+              <w:bidi w:val="1"/>
+            </w:pPr>
+            <w:r>
+              <w:rPr>
+                <w:rFonts w:ascii="Arial" w:hAnsi="Arial"/>
+                <w:sz w:val="24"/>
+              </w:rPr>
               <w:t>24.60</w:t>
             </w:r>
           </w:p>
@@ -1696,7 +1714,7 @@
                 <w:rFonts w:ascii="Arial" w:hAnsi="Arial"/>
                 <w:sz w:val="24"/>
               </w:rPr>
-              <w:t>26.80</w:t>
+              <w:t>28.40</w:t>
             </w:r>
           </w:p>
         </w:tc>
@@ -1715,24 +1733,6 @@
                 <w:sz w:val="24"/>
               </w:rPr>
               <w:t>26.25</w:t>
-            </w:r>
-          </w:p>
-        </w:tc>
-        <w:tc>
-          <w:tcPr>
-            <w:tcW w:type="dxa" w:w="1728"/>
-          </w:tcPr>
-          <w:p>
-            <w:pPr>
-              <w:jc w:val="center"/>
-              <w:bidi w:val="1"/>
-            </w:pPr>
-            <w:r>
-              <w:rPr>
-                <w:rFonts w:ascii="Arial" w:hAnsi="Arial"/>
-                <w:sz w:val="24"/>
-              </w:rPr>
-              <w:t>28.40</w:t>
             </w:r>
           </w:p>
         </w:tc>
@@ -1770,6 +1770,24 @@
                 <w:rFonts w:ascii="Arial" w:hAnsi="Arial"/>
                 <w:sz w:val="24"/>
               </w:rPr>
+              <w:t>28.55</w:t>
+            </w:r>
+          </w:p>
+        </w:tc>
+        <w:tc>
+          <w:tcPr>
+            <w:tcW w:type="dxa" w:w="1728"/>
+          </w:tcPr>
+          <w:p>
+            <w:pPr>
+              <w:jc w:val="center"/>
+              <w:bidi w:val="1"/>
+            </w:pPr>
+            <w:r>
+              <w:rPr>
+                <w:rFonts w:ascii="Arial" w:hAnsi="Arial"/>
+                <w:sz w:val="24"/>
+              </w:rPr>
               <w:t>24.55</w:t>
             </w:r>
           </w:p>
@@ -1788,7 +1806,7 @@
                 <w:rFonts w:ascii="Arial" w:hAnsi="Arial"/>
                 <w:sz w:val="24"/>
               </w:rPr>
-              <w:t>28.55</w:t>
+              <w:t>29.00</w:t>
             </w:r>
           </w:p>
         </w:tc>
@@ -1807,24 +1825,6 @@
                 <w:sz w:val="24"/>
               </w:rPr>
               <w:t>26.85</w:t>
-            </w:r>
-          </w:p>
-        </w:tc>
-        <w:tc>
-          <w:tcPr>
-            <w:tcW w:type="dxa" w:w="1728"/>
-          </w:tcPr>
-          <w:p>
-            <w:pPr>
-              <w:jc w:val="center"/>
-              <w:bidi w:val="1"/>
-            </w:pPr>
-            <w:r>
-              <w:rPr>
-                <w:rFonts w:ascii="Arial" w:hAnsi="Arial"/>
-                <w:sz w:val="24"/>
-              </w:rPr>
-              <w:t>29.00</w:t>
             </w:r>
           </w:p>
         </w:tc>
@@ -1862,6 +1862,24 @@
                 <w:rFonts w:ascii="Arial" w:hAnsi="Arial"/>
                 <w:sz w:val="24"/>
               </w:rPr>
+              <w:t>26.85</w:t>
+            </w:r>
+          </w:p>
+        </w:tc>
+        <w:tc>
+          <w:tcPr>
+            <w:tcW w:type="dxa" w:w="1728"/>
+          </w:tcPr>
+          <w:p>
+            <w:pPr>
+              <w:jc w:val="center"/>
+              <w:bidi w:val="1"/>
+            </w:pPr>
+            <w:r>
+              <w:rPr>
+                <w:rFonts w:ascii="Arial" w:hAnsi="Arial"/>
+                <w:sz w:val="24"/>
+              </w:rPr>
               <w:t>24.80</w:t>
             </w:r>
           </w:p>
@@ -1880,7 +1898,7 @@
                 <w:rFonts w:ascii="Arial" w:hAnsi="Arial"/>
                 <w:sz w:val="24"/>
               </w:rPr>
-              <w:t>26.85</w:t>
+              <w:t>28.35</w:t>
             </w:r>
           </w:p>
         </w:tc>
@@ -1899,24 +1917,6 @@
                 <w:sz w:val="24"/>
               </w:rPr>
               <w:t>27.65</w:t>
-            </w:r>
-          </w:p>
-        </w:tc>
-        <w:tc>
-          <w:tcPr>
-            <w:tcW w:type="dxa" w:w="1728"/>
-          </w:tcPr>
-          <w:p>
-            <w:pPr>
-              <w:jc w:val="center"/>
-              <w:bidi w:val="1"/>
-            </w:pPr>
-            <w:r>
-              <w:rPr>
-                <w:rFonts w:ascii="Arial" w:hAnsi="Arial"/>
-                <w:sz w:val="24"/>
-              </w:rPr>
-              <w:t>28.35</w:t>
             </w:r>
           </w:p>
         </w:tc>
@@ -1954,6 +1954,24 @@
                 <w:rFonts w:ascii="Arial" w:hAnsi="Arial"/>
                 <w:sz w:val="24"/>
               </w:rPr>
+              <w:t>28.40</w:t>
+            </w:r>
+          </w:p>
+        </w:tc>
+        <w:tc>
+          <w:tcPr>
+            <w:tcW w:type="dxa" w:w="1728"/>
+          </w:tcPr>
+          <w:p>
+            <w:pPr>
+              <w:jc w:val="center"/>
+              <w:bidi w:val="1"/>
+            </w:pPr>
+            <w:r>
+              <w:rPr>
+                <w:rFonts w:ascii="Arial" w:hAnsi="Arial"/>
+                <w:sz w:val="24"/>
+              </w:rPr>
               <w:t>25.00</w:t>
             </w:r>
           </w:p>
@@ -1972,7 +1990,7 @@
                 <w:rFonts w:ascii="Arial" w:hAnsi="Arial"/>
                 <w:sz w:val="24"/>
               </w:rPr>
-              <w:t>28.40</w:t>
+              <w:t>30.00</w:t>
             </w:r>
           </w:p>
         </w:tc>
@@ -1991,24 +2009,6 @@
                 <w:sz w:val="24"/>
               </w:rPr>
               <w:t>26.60</w:t>
-            </w:r>
-          </w:p>
-        </w:tc>
-        <w:tc>
-          <w:tcPr>
-            <w:tcW w:type="dxa" w:w="1728"/>
-          </w:tcPr>
-          <w:p>
-            <w:pPr>
-              <w:jc w:val="center"/>
-              <w:bidi w:val="1"/>
-            </w:pPr>
-            <w:r>
-              <w:rPr>
-                <w:rFonts w:ascii="Arial" w:hAnsi="Arial"/>
-                <w:sz w:val="24"/>
-              </w:rPr>
-              <w:t>30.00</w:t>
             </w:r>
           </w:p>
         </w:tc>

</xml_diff>